<commit_message>
fix(p11): clear residual complex-script italics
</commit_message>
<xml_diff>
--- a/tools/candidates/portfolio-owner-pdf-20261013/13-raschet-metrami/53-zapros-status-obekta.docx
+++ b/tools/candidates/portfolio-owner-pdf-20261013/13-raschet-metrami/53-zapros-status-obekta.docx
@@ -28,7 +28,7 @@
         <w:rPr>
           <w:rFonts w:ascii="Times New Roman" w:cs="Times New Roman" w:eastAsia="Times New Roman" w:hAnsi="Times New Roman"/>
           <w:i w:val="0"/>
-          <w:iCs/>
+          <w:iCs w:val="0"/>
           <w:color w:val="323539"/>
           <w:sz w:val="24"/>
           <w:szCs w:val="24"/>
@@ -156,7 +156,7 @@
         <w:rPr>
           <w:rFonts w:ascii="Times New Roman" w:cs="Times New Roman" w:eastAsia="Times New Roman" w:hAnsi="Times New Roman"/>
           <w:i w:val="0"/>
-          <w:iCs/>
+          <w:iCs w:val="0"/>
           <w:color w:val="323539"/>
           <w:sz w:val="24"/>
           <w:szCs w:val="24"/>
@@ -693,7 +693,7 @@
         <w:rPr>
           <w:rFonts w:ascii="Times New Roman" w:cs="Times New Roman" w:eastAsia="Times New Roman" w:hAnsi="Times New Roman"/>
           <w:i w:val="0"/>
-          <w:iCs/>
+          <w:iCs w:val="0"/>
           <w:color w:val="323539"/>
           <w:sz w:val="24"/>
           <w:szCs w:val="24"/>

</xml_diff>